<commit_message>
Restore VKR submission artifacts
</commit_message>
<xml_diff>
--- a/vkr/artifacts/М24-534_НосовАИ_задание_ВКР.docx
+++ b/vkr/artifacts/М24-534_НосовАИ_задание_ВКР.docx
@@ -925,8 +925,31 @@
               <w:rPr>
                 <w:sz w:val="22"/>
                 <w:szCs w:val="22"/>
-              </w:rPr>
-              <w:t>21.05.2026</w:t>
+                <w:lang w:val="ru-RU"/>
+              </w:rPr>
+              <w:t>05</w:t>
+            </w:r>
+            <w:r>
+              <w:rPr>
+                <w:sz w:val="22"/>
+                <w:szCs w:val="22"/>
+              </w:rPr>
+              <w:t>.0</w:t>
+            </w:r>
+            <w:r>
+              <w:rPr>
+                <w:sz w:val="22"/>
+                <w:szCs w:val="22"/>
+                <w:lang w:val="ru-RU"/>
+              </w:rPr>
+              <w:t>4</w:t>
+            </w:r>
+            <w:r>
+              <w:rPr>
+                <w:sz w:val="22"/>
+                <w:szCs w:val="22"/>
+              </w:rPr>
+              <w:t>.2026</w:t>
             </w:r>
           </w:p>
         </w:tc>
@@ -1040,8 +1063,31 @@
               <w:rPr>
                 <w:sz w:val="22"/>
                 <w:szCs w:val="22"/>
-              </w:rPr>
-              <w:t>24.05.2026</w:t>
+                <w:lang w:val="ru-RU"/>
+              </w:rPr>
+              <w:t>10</w:t>
+            </w:r>
+            <w:r>
+              <w:rPr>
+                <w:sz w:val="22"/>
+                <w:szCs w:val="22"/>
+              </w:rPr>
+              <w:t>.0</w:t>
+            </w:r>
+            <w:r>
+              <w:rPr>
+                <w:sz w:val="22"/>
+                <w:szCs w:val="22"/>
+                <w:lang w:val="ru-RU"/>
+              </w:rPr>
+              <w:t>4</w:t>
+            </w:r>
+            <w:r>
+              <w:rPr>
+                <w:sz w:val="22"/>
+                <w:szCs w:val="22"/>
+              </w:rPr>
+              <w:t>.2026</w:t>
             </w:r>
           </w:p>
         </w:tc>
@@ -1127,70 +1173,75 @@
                 <w:szCs w:val="22"/>
                 <w:lang w:val="ru-RU"/>
               </w:rPr>
-              <w:t xml:space="preserve">(BERT, </w:t>
-            </w:r>
-            <w:proofErr w:type="spellStart"/>
+              <w:t>(BERT, Sentence-BERT)</w:t>
+            </w:r>
+          </w:p>
+        </w:tc>
+        <w:tc>
+          <w:tcPr>
+            <w:tcW w:w="1515" w:type="dxa"/>
+          </w:tcPr>
+          <w:p>
+            <w:pPr>
+              <w:ind w:left="-108" w:right="-108"/>
+              <w:rPr>
+                <w:sz w:val="22"/>
+                <w:szCs w:val="22"/>
+              </w:rPr>
+            </w:pPr>
+            <w:r>
+              <w:rPr>
+                <w:sz w:val="22"/>
+                <w:szCs w:val="22"/>
+              </w:rPr>
+              <w:t>Раздел пояснительной записки ВКР, список источников</w:t>
+            </w:r>
+          </w:p>
+        </w:tc>
+        <w:tc>
+          <w:tcPr>
+            <w:tcW w:w="1245" w:type="dxa"/>
+            <w:tcBorders>
+              <w:right w:val="single" w:sz="12" w:space="0" w:color="000000"/>
+            </w:tcBorders>
+          </w:tcPr>
+          <w:p>
+            <w:pPr>
+              <w:jc w:val="center"/>
+              <w:rPr>
+                <w:sz w:val="22"/>
+                <w:szCs w:val="22"/>
+              </w:rPr>
+            </w:pPr>
             <w:r>
               <w:rPr>
                 <w:sz w:val="22"/>
                 <w:szCs w:val="22"/>
                 <w:lang w:val="ru-RU"/>
               </w:rPr>
-              <w:t>Sentence</w:t>
-            </w:r>
-            <w:proofErr w:type="spellEnd"/>
+              <w:t>15</w:t>
+            </w:r>
+            <w:r>
+              <w:rPr>
+                <w:sz w:val="22"/>
+                <w:szCs w:val="22"/>
+              </w:rPr>
+              <w:t>.0</w:t>
+            </w:r>
             <w:r>
               <w:rPr>
                 <w:sz w:val="22"/>
                 <w:szCs w:val="22"/>
                 <w:lang w:val="ru-RU"/>
               </w:rPr>
-              <w:t>-BERT)</w:t>
-            </w:r>
-          </w:p>
-        </w:tc>
-        <w:tc>
-          <w:tcPr>
-            <w:tcW w:w="1515" w:type="dxa"/>
-          </w:tcPr>
-          <w:p>
-            <w:pPr>
-              <w:ind w:left="-108" w:right="-108"/>
-              <w:rPr>
-                <w:sz w:val="22"/>
-                <w:szCs w:val="22"/>
-              </w:rPr>
-            </w:pPr>
-            <w:r>
-              <w:rPr>
-                <w:sz w:val="22"/>
-                <w:szCs w:val="22"/>
-              </w:rPr>
-              <w:t>Раздел пояснительной записки ВКР, список источников</w:t>
-            </w:r>
-          </w:p>
-        </w:tc>
-        <w:tc>
-          <w:tcPr>
-            <w:tcW w:w="1245" w:type="dxa"/>
-            <w:tcBorders>
-              <w:right w:val="single" w:sz="12" w:space="0" w:color="000000"/>
-            </w:tcBorders>
-          </w:tcPr>
-          <w:p>
-            <w:pPr>
-              <w:jc w:val="center"/>
-              <w:rPr>
-                <w:sz w:val="22"/>
-                <w:szCs w:val="22"/>
-              </w:rPr>
-            </w:pPr>
-            <w:r>
-              <w:rPr>
-                <w:sz w:val="22"/>
-                <w:szCs w:val="22"/>
-              </w:rPr>
-              <w:t>28.05.2026</w:t>
+              <w:t>4</w:t>
+            </w:r>
+            <w:r>
+              <w:rPr>
+                <w:sz w:val="22"/>
+                <w:szCs w:val="22"/>
+              </w:rPr>
+              <w:t>.2026</w:t>
             </w:r>
           </w:p>
         </w:tc>
@@ -1413,8 +1464,31 @@
               <w:rPr>
                 <w:sz w:val="22"/>
                 <w:szCs w:val="22"/>
-              </w:rPr>
-              <w:t>31.05.2026</w:t>
+                <w:lang w:val="ru-RU"/>
+              </w:rPr>
+              <w:t>20</w:t>
+            </w:r>
+            <w:r>
+              <w:rPr>
+                <w:sz w:val="22"/>
+                <w:szCs w:val="22"/>
+              </w:rPr>
+              <w:t>.0</w:t>
+            </w:r>
+            <w:r>
+              <w:rPr>
+                <w:sz w:val="22"/>
+                <w:szCs w:val="22"/>
+                <w:lang w:val="ru-RU"/>
+              </w:rPr>
+              <w:t>4</w:t>
+            </w:r>
+            <w:r>
+              <w:rPr>
+                <w:sz w:val="22"/>
+                <w:szCs w:val="22"/>
+              </w:rPr>
+              <w:t>.2026</w:t>
             </w:r>
           </w:p>
         </w:tc>
@@ -1482,23 +1556,7 @@
                 <w:sz w:val="22"/>
                 <w:szCs w:val="22"/>
               </w:rPr>
-              <w:t xml:space="preserve">Разработка архитектуры </w:t>
-            </w:r>
-            <w:proofErr w:type="spellStart"/>
-            <w:r>
-              <w:rPr>
-                <w:sz w:val="22"/>
-                <w:szCs w:val="22"/>
-              </w:rPr>
-              <w:t>пайплайна</w:t>
-            </w:r>
-            <w:proofErr w:type="spellEnd"/>
-            <w:r>
-              <w:rPr>
-                <w:sz w:val="22"/>
-                <w:szCs w:val="22"/>
-              </w:rPr>
-              <w:t xml:space="preserve"> предварительной обработки данных и модуля семантического анализа</w:t>
+              <w:t>Разработка архитектуры пайплайна предварительной обработки данных и модуля семантического анализа</w:t>
             </w:r>
           </w:p>
         </w:tc>
@@ -1543,8 +1601,31 @@
               <w:rPr>
                 <w:sz w:val="22"/>
                 <w:szCs w:val="22"/>
-              </w:rPr>
-              <w:t>04.06.2026</w:t>
+                <w:lang w:val="ru-RU"/>
+              </w:rPr>
+              <w:t>25</w:t>
+            </w:r>
+            <w:r>
+              <w:rPr>
+                <w:sz w:val="22"/>
+                <w:szCs w:val="22"/>
+              </w:rPr>
+              <w:t>.0</w:t>
+            </w:r>
+            <w:r>
+              <w:rPr>
+                <w:sz w:val="22"/>
+                <w:szCs w:val="22"/>
+                <w:lang w:val="ru-RU"/>
+              </w:rPr>
+              <w:t>4</w:t>
+            </w:r>
+            <w:r>
+              <w:rPr>
+                <w:sz w:val="22"/>
+                <w:szCs w:val="22"/>
+              </w:rPr>
+              <w:t>.2026</w:t>
             </w:r>
           </w:p>
         </w:tc>
@@ -1629,14 +1710,7 @@
                 <w:sz w:val="22"/>
                 <w:szCs w:val="22"/>
               </w:rPr>
-              <w:t>Описание интерфейсов и схем интеграции</w:t>
-            </w:r>
-            <w:r>
-              <w:rPr>
-                <w:sz w:val="22"/>
-                <w:szCs w:val="22"/>
-              </w:rPr>
-              <w:t xml:space="preserve"> </w:t>
+              <w:t xml:space="preserve">Описание интерфейсов и схем интеграции </w:t>
             </w:r>
             <w:r>
               <w:rPr>
@@ -1667,7 +1741,37 @@
                 <w:sz w:val="22"/>
                 <w:szCs w:val="22"/>
               </w:rPr>
-              <w:t>07.06.2026</w:t>
+              <w:t>0</w:t>
+            </w:r>
+            <w:r>
+              <w:rPr>
+                <w:sz w:val="22"/>
+                <w:szCs w:val="22"/>
+                <w:lang w:val="ru-RU"/>
+              </w:rPr>
+              <w:t>5</w:t>
+            </w:r>
+            <w:r>
+              <w:rPr>
+                <w:sz w:val="22"/>
+                <w:szCs w:val="22"/>
+              </w:rPr>
+              <w:t>.0</w:t>
+            </w:r>
+            <w:r>
+              <w:rPr>
+                <w:sz w:val="22"/>
+                <w:szCs w:val="22"/>
+                <w:lang w:val="ru-RU"/>
+              </w:rPr>
+              <w:t>5</w:t>
+            </w:r>
+            <w:r>
+              <w:rPr>
+                <w:sz w:val="22"/>
+                <w:szCs w:val="22"/>
+              </w:rPr>
+              <w:t>.2026</w:t>
             </w:r>
           </w:p>
         </w:tc>
@@ -1853,17 +1957,8 @@
                 <w:sz w:val="22"/>
                 <w:szCs w:val="22"/>
               </w:rPr>
-              <w:t xml:space="preserve">Реализация программных компонентов подготовки данных и машинно-обучающего </w:t>
-            </w:r>
-            <w:proofErr w:type="spellStart"/>
-            <w:r>
-              <w:rPr>
-                <w:sz w:val="22"/>
-                <w:szCs w:val="22"/>
-              </w:rPr>
-              <w:t>пайплайна</w:t>
-            </w:r>
-            <w:proofErr w:type="spellEnd"/>
+              <w:t>Реализация программных компонентов подготовки данных и машинно-обучающего пайплайна</w:t>
+            </w:r>
           </w:p>
         </w:tc>
         <w:tc>
@@ -1906,8 +2001,31 @@
               <w:rPr>
                 <w:sz w:val="22"/>
                 <w:szCs w:val="22"/>
-              </w:rPr>
-              <w:t>11.06.2026</w:t>
+                <w:lang w:val="ru-RU"/>
+              </w:rPr>
+              <w:t>10</w:t>
+            </w:r>
+            <w:r>
+              <w:rPr>
+                <w:sz w:val="22"/>
+                <w:szCs w:val="22"/>
+              </w:rPr>
+              <w:t>.0</w:t>
+            </w:r>
+            <w:r>
+              <w:rPr>
+                <w:sz w:val="22"/>
+                <w:szCs w:val="22"/>
+                <w:lang w:val="ru-RU"/>
+              </w:rPr>
+              <w:t>5</w:t>
+            </w:r>
+            <w:r>
+              <w:rPr>
+                <w:sz w:val="22"/>
+                <w:szCs w:val="22"/>
+              </w:rPr>
+              <w:t>.2026</w:t>
             </w:r>
           </w:p>
         </w:tc>
@@ -2027,8 +2145,31 @@
               <w:rPr>
                 <w:sz w:val="22"/>
                 <w:szCs w:val="22"/>
-              </w:rPr>
-              <w:t>14.06.2026</w:t>
+                <w:lang w:val="ru-RU"/>
+              </w:rPr>
+              <w:t>15</w:t>
+            </w:r>
+            <w:r>
+              <w:rPr>
+                <w:sz w:val="22"/>
+                <w:szCs w:val="22"/>
+              </w:rPr>
+              <w:t>.0</w:t>
+            </w:r>
+            <w:r>
+              <w:rPr>
+                <w:sz w:val="22"/>
+                <w:szCs w:val="22"/>
+                <w:lang w:val="ru-RU"/>
+              </w:rPr>
+              <w:t>5</w:t>
+            </w:r>
+            <w:r>
+              <w:rPr>
+                <w:sz w:val="22"/>
+                <w:szCs w:val="22"/>
+              </w:rPr>
+              <w:t>.2026</w:t>
             </w:r>
           </w:p>
         </w:tc>
@@ -2140,8 +2281,31 @@
               <w:rPr>
                 <w:sz w:val="22"/>
                 <w:szCs w:val="22"/>
-              </w:rPr>
-              <w:t>18.06.2026</w:t>
+                <w:lang w:val="ru-RU"/>
+              </w:rPr>
+              <w:t>20</w:t>
+            </w:r>
+            <w:r>
+              <w:rPr>
+                <w:sz w:val="22"/>
+                <w:szCs w:val="22"/>
+              </w:rPr>
+              <w:t>.0</w:t>
+            </w:r>
+            <w:r>
+              <w:rPr>
+                <w:sz w:val="22"/>
+                <w:szCs w:val="22"/>
+                <w:lang w:val="ru-RU"/>
+              </w:rPr>
+              <w:t>5</w:t>
+            </w:r>
+            <w:r>
+              <w:rPr>
+                <w:sz w:val="22"/>
+                <w:szCs w:val="22"/>
+              </w:rPr>
+              <w:t>.2026</w:t>
             </w:r>
           </w:p>
         </w:tc>
@@ -2319,23 +2483,7 @@
                 <w:sz w:val="22"/>
                 <w:szCs w:val="22"/>
               </w:rPr>
-              <w:t xml:space="preserve">Проведение экспериментальной оценки качества разработанного алгоритма ранжирования с использованием метрик NDCG, </w:t>
-            </w:r>
-            <w:proofErr w:type="spellStart"/>
-            <w:r>
-              <w:rPr>
-                <w:sz w:val="22"/>
-                <w:szCs w:val="22"/>
-              </w:rPr>
-              <w:t>Precision@K</w:t>
-            </w:r>
-            <w:proofErr w:type="spellEnd"/>
-            <w:r>
-              <w:rPr>
-                <w:sz w:val="22"/>
-                <w:szCs w:val="22"/>
-              </w:rPr>
-              <w:t xml:space="preserve"> и других показателей</w:t>
+              <w:t>Проведение экспериментальной оценки качества разработанного алгоритма ранжирования с использованием метрик NDCG, Precision@K и других показателей</w:t>
             </w:r>
           </w:p>
         </w:tc>
@@ -2380,7 +2528,37 @@
                 <w:sz w:val="22"/>
                 <w:szCs w:val="22"/>
               </w:rPr>
-              <w:t>21.06.2026</w:t>
+              <w:t>2</w:t>
+            </w:r>
+            <w:r>
+              <w:rPr>
+                <w:sz w:val="22"/>
+                <w:szCs w:val="22"/>
+                <w:lang w:val="ru-RU"/>
+              </w:rPr>
+              <w:t>5</w:t>
+            </w:r>
+            <w:r>
+              <w:rPr>
+                <w:sz w:val="22"/>
+                <w:szCs w:val="22"/>
+              </w:rPr>
+              <w:t>.0</w:t>
+            </w:r>
+            <w:r>
+              <w:rPr>
+                <w:sz w:val="22"/>
+                <w:szCs w:val="22"/>
+                <w:lang w:val="ru-RU"/>
+              </w:rPr>
+              <w:t>5</w:t>
+            </w:r>
+            <w:r>
+              <w:rPr>
+                <w:sz w:val="22"/>
+                <w:szCs w:val="22"/>
+              </w:rPr>
+              <w:t>.2026</w:t>
             </w:r>
           </w:p>
         </w:tc>
@@ -2494,8 +2672,24 @@
               <w:rPr>
                 <w:sz w:val="22"/>
                 <w:szCs w:val="22"/>
-              </w:rPr>
-              <w:t>25.06.2026</w:t>
+                <w:lang w:val="ru-RU"/>
+              </w:rPr>
+              <w:t>0</w:t>
+            </w:r>
+            <w:r>
+              <w:rPr>
+                <w:sz w:val="22"/>
+                <w:szCs w:val="22"/>
+                <w:lang w:val="ru-RU"/>
+              </w:rPr>
+              <w:t>1</w:t>
+            </w:r>
+            <w:r>
+              <w:rPr>
+                <w:sz w:val="22"/>
+                <w:szCs w:val="22"/>
+              </w:rPr>
+              <w:t>.06.2026</w:t>
             </w:r>
           </w:p>
         </w:tc>
@@ -2608,8 +2802,16 @@
               <w:rPr>
                 <w:sz w:val="22"/>
                 <w:szCs w:val="22"/>
-              </w:rPr>
-              <w:t>28.06.2026</w:t>
+                <w:lang w:val="ru-RU"/>
+              </w:rPr>
+              <w:t>09</w:t>
+            </w:r>
+            <w:r>
+              <w:rPr>
+                <w:sz w:val="22"/>
+                <w:szCs w:val="22"/>
+              </w:rPr>
+              <w:t>.06.2026</w:t>
             </w:r>
           </w:p>
         </w:tc>
@@ -2865,21 +3067,7 @@
               <w:rPr>
                 <w:lang w:val="en-US"/>
               </w:rPr>
-              <w:t xml:space="preserve">Reimers N., </w:t>
-            </w:r>
-            <w:proofErr w:type="spellStart"/>
-            <w:r>
-              <w:rPr>
-                <w:lang w:val="en-US"/>
-              </w:rPr>
-              <w:t>Gurevych</w:t>
-            </w:r>
-            <w:proofErr w:type="spellEnd"/>
-            <w:r>
-              <w:rPr>
-                <w:lang w:val="en-US"/>
-              </w:rPr>
-              <w:t xml:space="preserve"> I. Sentence-BERT: Sentence Embeddings using Siamese BERT-Networks // Proceedings of EMNLP-IJCNLP 2019. — 2019. — P. 3982-3992.</w:t>
+              <w:t>Reimers N., Gurevych I. Sentence-BERT: Sentence Embeddings using Siamese BERT-Networks // Proceedings of EMNLP-IJCNLP 2019. — 2019. — P. 3982-3992.</w:t>
             </w:r>
           </w:p>
         </w:tc>
@@ -2967,19 +3155,11 @@
                 <w:lang w:val="en-US"/>
               </w:rPr>
             </w:pPr>
-            <w:proofErr w:type="spellStart"/>
             <w:r>
               <w:rPr>
                 <w:lang w:val="en-US"/>
               </w:rPr>
-              <w:t>Jurafsky</w:t>
-            </w:r>
-            <w:proofErr w:type="spellEnd"/>
-            <w:r>
-              <w:rPr>
-                <w:lang w:val="en-US"/>
-              </w:rPr>
-              <w:t xml:space="preserve"> D., Martin J. H. Speech and Language Processing // 3rd ed. draft. — Stanford University, 2024.</w:t>
+              <w:t>Jurafsky D., Martin J. H. Speech and Language Processing // 3rd ed. draft. — Stanford University, 2024.</w:t>
             </w:r>
           </w:p>
         </w:tc>
@@ -3025,21 +3205,7 @@
               <w:rPr>
                 <w:lang w:val="en-US"/>
               </w:rPr>
-              <w:t xml:space="preserve">Vaswani A., </w:t>
-            </w:r>
-            <w:proofErr w:type="spellStart"/>
-            <w:r>
-              <w:rPr>
-                <w:lang w:val="en-US"/>
-              </w:rPr>
-              <w:t>Shazeer</w:t>
-            </w:r>
-            <w:proofErr w:type="spellEnd"/>
-            <w:r>
-              <w:rPr>
-                <w:lang w:val="en-US"/>
-              </w:rPr>
-              <w:t xml:space="preserve"> N., Parmar N. et al. Attention is all you need // Advances in Neural Information Processing Systems (NIPS 2017). — 2017. — P. 5998-6008.</w:t>
+              <w:t>Vaswani A., Shazeer N., Parmar N. et al. Attention is all you need // Advances in Neural Information Processing Systems (NIPS 2017). — 2017. — P. 5998-6008.</w:t>
             </w:r>
           </w:p>
         </w:tc>
@@ -3085,35 +3251,7 @@
               <w:rPr>
                 <w:lang w:val="en-US"/>
               </w:rPr>
-              <w:t xml:space="preserve">Bianchi F., </w:t>
-            </w:r>
-            <w:proofErr w:type="spellStart"/>
-            <w:r>
-              <w:rPr>
-                <w:lang w:val="en-US"/>
-              </w:rPr>
-              <w:t>Terragni</w:t>
-            </w:r>
-            <w:proofErr w:type="spellEnd"/>
-            <w:r>
-              <w:rPr>
-                <w:lang w:val="en-US"/>
-              </w:rPr>
-              <w:t xml:space="preserve"> S., </w:t>
-            </w:r>
-            <w:proofErr w:type="spellStart"/>
-            <w:r>
-              <w:rPr>
-                <w:lang w:val="en-US"/>
-              </w:rPr>
-              <w:t>Hovy</w:t>
-            </w:r>
-            <w:proofErr w:type="spellEnd"/>
-            <w:r>
-              <w:rPr>
-                <w:lang w:val="en-US"/>
-              </w:rPr>
-              <w:t xml:space="preserve"> D. Pre-training is a Hot Topic: Contextualized Document Embeddings Improve Topic Coherence // Proceedings of ACL-IJCNLP 2021. — 2021. — P. 759-766.</w:t>
+              <w:t>Bianchi F., Terragni S., Hovy D. Pre-training is a Hot Topic: Contextualized Document Embeddings Improve Topic Coherence // Proceedings of ACL-IJCNLP 2021. — 2021. — P. 759-766.</w:t>
             </w:r>
           </w:p>
         </w:tc>
@@ -3432,7 +3570,7 @@
                 <w:szCs w:val="24"/>
                 <w:lang w:val="ru-RU"/>
               </w:rPr>
-              <w:t>21</w:t>
+              <w:t>05</w:t>
             </w:r>
           </w:p>
         </w:tc>
@@ -3487,7 +3625,7 @@
                 <w:szCs w:val="24"/>
                 <w:lang w:val="ru-RU"/>
               </w:rPr>
-              <w:t>мая</w:t>
+              <w:t>апреля</w:t>
             </w:r>
           </w:p>
         </w:tc>
@@ -4470,6 +4608,7 @@
   <w:style w:type="character" w:default="1" w:styleId="a0">
     <w:name w:val="Default Paragraph Font"/>
     <w:uiPriority w:val="1"/>
+    <w:semiHidden/>
     <w:unhideWhenUsed/>
   </w:style>
   <w:style w:type="table" w:default="1" w:styleId="a1">
@@ -4621,9 +4760,7 @@
       <w:tblStyleRowBandSize w:val="1"/>
       <w:tblStyleColBandSize w:val="1"/>
       <w:tblCellMar>
-        <w:top w:w="0" w:type="dxa"/>
         <w:left w:w="108" w:type="dxa"/>
-        <w:bottom w:w="0" w:type="dxa"/>
         <w:right w:w="108" w:type="dxa"/>
       </w:tblCellMar>
     </w:tblPr>
@@ -4634,9 +4771,7 @@
       <w:tblStyleRowBandSize w:val="1"/>
       <w:tblStyleColBandSize w:val="1"/>
       <w:tblCellMar>
-        <w:top w:w="0" w:type="dxa"/>
         <w:left w:w="108" w:type="dxa"/>
-        <w:bottom w:w="0" w:type="dxa"/>
         <w:right w:w="108" w:type="dxa"/>
       </w:tblCellMar>
     </w:tblPr>
@@ -4647,9 +4782,7 @@
       <w:tblStyleRowBandSize w:val="1"/>
       <w:tblStyleColBandSize w:val="1"/>
       <w:tblCellMar>
-        <w:top w:w="0" w:type="dxa"/>
         <w:left w:w="115" w:type="dxa"/>
-        <w:bottom w:w="0" w:type="dxa"/>
         <w:right w:w="115" w:type="dxa"/>
       </w:tblCellMar>
     </w:tblPr>
@@ -4660,9 +4793,7 @@
       <w:tblStyleRowBandSize w:val="1"/>
       <w:tblStyleColBandSize w:val="1"/>
       <w:tblCellMar>
-        <w:top w:w="0" w:type="dxa"/>
         <w:left w:w="108" w:type="dxa"/>
-        <w:bottom w:w="0" w:type="dxa"/>
         <w:right w:w="108" w:type="dxa"/>
       </w:tblCellMar>
     </w:tblPr>
@@ -4673,9 +4804,7 @@
       <w:tblStyleRowBandSize w:val="1"/>
       <w:tblStyleColBandSize w:val="1"/>
       <w:tblCellMar>
-        <w:top w:w="0" w:type="dxa"/>
         <w:left w:w="108" w:type="dxa"/>
-        <w:bottom w:w="0" w:type="dxa"/>
         <w:right w:w="108" w:type="dxa"/>
       </w:tblCellMar>
     </w:tblPr>
@@ -4686,9 +4815,7 @@
       <w:tblStyleRowBandSize w:val="1"/>
       <w:tblStyleColBandSize w:val="1"/>
       <w:tblCellMar>
-        <w:top w:w="0" w:type="dxa"/>
         <w:left w:w="108" w:type="dxa"/>
-        <w:bottom w:w="0" w:type="dxa"/>
         <w:right w:w="108" w:type="dxa"/>
       </w:tblCellMar>
     </w:tblPr>
@@ -4699,9 +4826,7 @@
       <w:tblStyleRowBandSize w:val="1"/>
       <w:tblStyleColBandSize w:val="1"/>
       <w:tblCellMar>
-        <w:top w:w="0" w:type="dxa"/>
         <w:left w:w="108" w:type="dxa"/>
-        <w:bottom w:w="0" w:type="dxa"/>
         <w:right w:w="108" w:type="dxa"/>
       </w:tblCellMar>
     </w:tblPr>
@@ -4712,9 +4837,7 @@
       <w:tblStyleRowBandSize w:val="1"/>
       <w:tblStyleColBandSize w:val="1"/>
       <w:tblCellMar>
-        <w:top w:w="0" w:type="dxa"/>
         <w:left w:w="115" w:type="dxa"/>
-        <w:bottom w:w="0" w:type="dxa"/>
         <w:right w:w="115" w:type="dxa"/>
       </w:tblCellMar>
     </w:tblPr>
@@ -4725,9 +4848,7 @@
       <w:tblStyleRowBandSize w:val="1"/>
       <w:tblStyleColBandSize w:val="1"/>
       <w:tblCellMar>
-        <w:top w:w="0" w:type="dxa"/>
         <w:left w:w="108" w:type="dxa"/>
-        <w:bottom w:w="0" w:type="dxa"/>
         <w:right w:w="108" w:type="dxa"/>
       </w:tblCellMar>
     </w:tblPr>
@@ -4738,9 +4859,7 @@
       <w:tblStyleRowBandSize w:val="1"/>
       <w:tblStyleColBandSize w:val="1"/>
       <w:tblCellMar>
-        <w:top w:w="0" w:type="dxa"/>
         <w:left w:w="108" w:type="dxa"/>
-        <w:bottom w:w="0" w:type="dxa"/>
         <w:right w:w="108" w:type="dxa"/>
       </w:tblCellMar>
     </w:tblPr>
@@ -4778,9 +4897,7 @@
       <w:tblStyleRowBandSize w:val="1"/>
       <w:tblStyleColBandSize w:val="1"/>
       <w:tblCellMar>
-        <w:top w:w="0" w:type="dxa"/>
         <w:left w:w="108" w:type="dxa"/>
-        <w:bottom w:w="0" w:type="dxa"/>
         <w:right w:w="108" w:type="dxa"/>
       </w:tblCellMar>
     </w:tblPr>
@@ -4791,9 +4908,7 @@
       <w:tblStyleRowBandSize w:val="1"/>
       <w:tblStyleColBandSize w:val="1"/>
       <w:tblCellMar>
-        <w:top w:w="0" w:type="dxa"/>
         <w:left w:w="108" w:type="dxa"/>
-        <w:bottom w:w="0" w:type="dxa"/>
         <w:right w:w="108" w:type="dxa"/>
       </w:tblCellMar>
     </w:tblPr>
@@ -4804,9 +4919,7 @@
       <w:tblStyleRowBandSize w:val="1"/>
       <w:tblStyleColBandSize w:val="1"/>
       <w:tblCellMar>
-        <w:top w:w="0" w:type="dxa"/>
         <w:left w:w="115" w:type="dxa"/>
-        <w:bottom w:w="0" w:type="dxa"/>
         <w:right w:w="115" w:type="dxa"/>
       </w:tblCellMar>
     </w:tblPr>
@@ -4817,9 +4930,7 @@
       <w:tblStyleRowBandSize w:val="1"/>
       <w:tblStyleColBandSize w:val="1"/>
       <w:tblCellMar>
-        <w:top w:w="0" w:type="dxa"/>
         <w:left w:w="108" w:type="dxa"/>
-        <w:bottom w:w="0" w:type="dxa"/>
         <w:right w:w="108" w:type="dxa"/>
       </w:tblCellMar>
     </w:tblPr>
@@ -4830,9 +4941,7 @@
       <w:tblStyleRowBandSize w:val="1"/>
       <w:tblStyleColBandSize w:val="1"/>
       <w:tblCellMar>
-        <w:top w:w="0" w:type="dxa"/>
         <w:left w:w="108" w:type="dxa"/>
-        <w:bottom w:w="0" w:type="dxa"/>
         <w:right w:w="108" w:type="dxa"/>
       </w:tblCellMar>
     </w:tblPr>

</xml_diff>